<commit_message>
Final submission canvas: Zero fabrication, defensible metrics, generic architecture, honest evidence
</commit_message>
<xml_diff>
--- a/HARIS_Idea_Canvas_SUBMISSION.docx
+++ b/HARIS_Idea_Canvas_SUBMISSION.docx
@@ -228,9 +228,9 @@
               <w:br/>
               <w:t>Stage: Idea Canvas (Stage 1)</w:t>
               <w:br/>
-              <w:t>Languages covered: English, Arabic (Gulf), Hindi, Urdu</w:t>
+              <w:t>Languages covered: English, Arabic (Gulf dialect route), Hindi, Urdu</w:t>
               <w:br/>
-              <w:t>Prior ElevenLabs use: Y (Active workflow created on ElevenLabs Agent Workflows)</w:t>
+              <w:t>Prior ElevenLabs use: Y (Configured Agent Workflow in workspace)</w:t>
               <w:br/>
               <w:t>Team size / based in: 1 / Dubai, UAE</w:t>
               <w:br/>
@@ -1235,7 +1235,7 @@
                 <w:rFonts w:ascii="Arial" w:hAnsi="Arial"/>
                 <w:sz w:val="19"/>
               </w:rPr>
-              <w:t>A fraud engine flags an anomalous transaction in milliseconds, but queues the alert into human outbound dialling pools. Outbound phone contact takes 4 to 8 minutes at UAE banks. During this delay, the customer remains unaware while social engineering or automated account takeover completes. When contact occurs, expatriate customers face language friction: retail lines operate primarily in English and Arabic, leaving Hindi and Urdu speakers unable to comprehend the urgency. Furthermore, manual agents routinely ask callers for security credentials, normalizing phishing habits under CBUAE rules. The customer is left waiting, funds drain permanently, and the bank absorbs regulatory liability under notice 2025/3057.</w:t>
+              <w:t>A fraud engine flags an anomalous transaction in milliseconds, but queues the alert into human outbound dialling pools, creating an operational contact delay where social engineering or unauthorized clearing completes. When contact occurs, expatriate customers face language friction: retail lines operate primarily in English and Arabic, leaving Hindi and Urdu speakers unable to comprehend the urgency. Furthermore, manual agents routinely ask callers for security credentials, normalizing phishing habits under CBUAE rules. The customer is left waiting, funds drain permanently, and the bank absorbs regulatory liability under notice 2025/3057.</w:t>
             </w:r>
           </w:p>
         </w:tc>
@@ -1405,11 +1405,11 @@
                 <w:rFonts w:ascii="Arial" w:hAnsi="Arial"/>
                 <w:sz w:val="19"/>
               </w:rPr>
-              <w:t>Outbound contact delay: 6.2 minutes median | Source: Deloitte Middle East Banking Fraud Survey 2025</w:t>
+              <w:t>Operational queue delay before outbound dial: Estimated 4 to 8 minutes in tiered contact centers.</w:t>
               <w:br/>
-              <w:t>First-attempt contact rate: 32% | Source: UAE Retail Banking Contact Centre Benchmark 2025</w:t>
+              <w:t>Market context on scam recovery: 9% of UAE scam victims fully recovered lost funds (GASA/BioCatch survey of ~2,000 UAE residents, Nov 2024).</w:t>
               <w:br/>
-              <w:t>Scam loss recovery rate: 9% | Source: BioCatch GCC Banking Fraud Report 2026</w:t>
+              <w:t>Institutional fraud exposure: 62% of surveyed UAE banking leaders report annual fraud losses exceeding AED 18.3 million (BioCatch survey of 100 UAE leaders, April 2026).</w:t>
             </w:r>
           </w:p>
           <w:tbl>
@@ -1877,7 +1877,7 @@
                 <w:rFonts w:ascii="Arial" w:hAnsi="Arial"/>
                 <w:sz w:val="19"/>
               </w:rPr>
-              <w:t>UAE Retail Banks (e.g., Emirates NBD, ADCB, FAB). Signing title: Group Head of Fraud Prevention or Chief Information Security Officer (CISO). Budget line: Fraud Operations &amp; Financial Crime Compliance, accelerated by CBUAE Notice 2025/3057 mandating institutional liability for authentication failures.</w:t>
+              <w:t>UAE Retail Banks (e.g. Emirates NBD, ADCB, FAB). Signing title: Group Head of Fraud Prevention or Chief Information Security Officer (CISO). Budget line: Fraud Operations &amp; Financial Crime Compliance, accelerated by CBUAE Notice No. CBUAE/FCMCP/2025/3057 mandating institutional liability for authentication failures.</w:t>
             </w:r>
           </w:p>
         </w:tc>
@@ -2120,14 +2120,7 @@
                 <w:rFonts w:ascii="Arial" w:hAnsi="Arial"/>
                 <w:sz w:val="19"/>
               </w:rPr>
-              <w:t>Tariq Al-Mansoori, Fraud Operations Lead | Tier-1 UAE Retail Bank | Sept 4, 2026</w:t>
-              <w:br/>
-              <w:t>The one thing they said that changed your idea: "Our fraud detection takes 4 milliseconds, but our outbound queue takes 6 minutes. By the time an analyst dials, the OTP or transfer has already cleared."</w:t>
-              <w:br/>
-              <w:br/>
-              <w:t>Rehan Siddiqui, Collections &amp; Contact Centre Director | Dubai Islamic Consumer Finance | Sept 11, 2026</w:t>
-              <w:br/>
-              <w:t xml:space="preserve">The one thing they said that changed your idea: "Over 40% of our cardholders speak Urdu or Hindi as their primary language. When panic hits, English IVR drops call completion below 30%." </w:t>
+              <w:t>No primary institutional interviews were conducted for Stage 1. Operational problem definition and compliance requirements are derived strictly from CBUAE regulatory notices (Notice No. CBUAE/FCMCP/2025/3057) and published GCC fraud research (BioCatch/GASA, Nov 2024 &amp; April 2026). Primary institutional interviews are planned for the Stage 2 Build Sprint.</w:t>
             </w:r>
           </w:p>
           <w:tbl>
@@ -2673,7 +2666,7 @@
                 <w:rFonts w:ascii="Arial" w:hAnsi="Arial"/>
                 <w:sz w:val="19"/>
               </w:rPr>
-              <w:t>We assumed customers would verify via mobile push notifications during the call. Fraud leads revealed scammers actively instruct victims to ignore notifications. We pivoted to voice-native challenge questions using public-identifier cross-checks (last four Emirates ID digits and last known merchant) without requesting secrets.</w:t>
+              <w:t>We assumed customers would verify transactions via mobile app push notifications during the call. Operational fraud reports revealed scammers actively instruct victims to ignore notifications. We pivoted to voice-native challenge questions using public-identifier cross-checks (last four Emirates ID digits and last known merchant) without requesting secrets.</w:t>
             </w:r>
           </w:p>
         </w:tc>
@@ -2843,48 +2836,13 @@
                 <w:rFonts w:ascii="Arial" w:hAnsi="Arial"/>
                 <w:sz w:val="19"/>
               </w:rPr>
-              <w:t>LANE 1: Customer</w:t>
+              <w:t>LANE 1 (Customer): Transaction occurs -&gt; Receives SMS alert (often missed/delayed) -&gt; Waits unaware -&gt; Receives unverified call -&gt; Skepticism/hang-up -&gt; Loss finalized.</w:t>
               <w:br/>
-              <w:t>Stage 1: Unauthorized transaction occurs</w:t>
+              <w:t>LANE 2 (Fraud Analyst): Alert generated in fraud engine -&gt; Ticket queued -&gt; Analyst dials customer -&gt; Language friction/no answer -&gt; Manual verification -&gt; Manual card freeze.</w:t>
               <w:br/>
-              <w:t>Stage 2: Misses/misunderstands English SMS alert</w:t>
+              <w:t>LANE 3 (Back Office): Receives freeze escalation -&gt; Reviews case history -&gt; Approves card block.</w:t>
               <w:br/>
-              <w:t>Stage 3: Waits 6+ minutes unaware</w:t>
-              <w:br/>
-              <w:t>Stage 4: Receives suspicious unverified call</w:t>
-              <w:br/>
-              <w:t>Stage 5: Panic &amp; credential disclosure</w:t>
-              <w:br/>
-              <w:t>Stage 6: Irreversible loss</w:t>
-              <w:br/>
-              <w:br/>
-              <w:t>LANE 2: Front-line staff (Fraud Analyst)</w:t>
-              <w:br/>
-              <w:t>Stage 1: System alert raised</w:t>
-              <w:br/>
-              <w:t>Stage 2: Analyst picks queue ticket (4-8m delay)</w:t>
-              <w:br/>
-              <w:t>Stage 3: Outbound dial attempt</w:t>
-              <w:br/>
-              <w:t>Stage 4: Language mismatch / no answer</w:t>
-              <w:br/>
-              <w:t>Stage 5: Manual verification attempt</w:t>
-              <w:br/>
-              <w:t>Stage 6: Manual card freeze ticket</w:t>
-              <w:br/>
-              <w:br/>
-              <w:t>LANE 3: Back office or approver</w:t>
-              <w:br/>
-              <w:t>Stage 1-4: Idle</w:t>
-              <w:br/>
-              <w:t>Stage 5: Escalation review</w:t>
-              <w:br/>
-              <w:t>Stage 6: Sign-off &amp; audit logging</w:t>
-              <w:br/>
-              <w:br/>
-              <w:t>SYSTEMS TOUCHED: Fraud Engine (Falcon/SAS) -&gt; CTI/IVR -&gt; Core Banking (Finacle) -&gt; Card Management System</w:t>
-              <w:br/>
-              <w:t>ELAPSED TIME: 6 to 14 minutes total. Fails at Step 3 (Dial Queue Gap).</w:t>
+              <w:t>Systems Touched: Fraud Detection Engine -&gt; Outbound Contact Orchestrator -&gt; ElevenLabs Voice Agent -&gt; Bank Verification Service -&gt; Card Management Gateway -&gt; Case Management / Human Queue. (Core banking integrations are deployment-dependent). Fails at the manual queue bottleneck.</w:t>
             </w:r>
           </w:p>
           <w:tbl>
@@ -4875,9 +4833,9 @@
               <w:br/>
               <w:t>Why these two:</w:t>
               <w:br/>
-              <w:t>1. Sub-agents with per-node tool scoping: Isolates freeze_card strictly inside the GUARD sub-agent, preventing unauthorized or irreversible account actions structurally rather than through prompting.</w:t>
+              <w:t>1. Sub-agents with per-node tool scoping: Physically isolates freeze_card inside GUARD. Prevents unauthorized financial actions structurally rather than through prompting.</w:t>
               <w:br/>
-              <w:t>2. Post-call webhooks: Automatically publishes structured JSON transcripts, verification outcomes, and timestamped audit logs to the bank's case management system to satisfy CBUAE regulatory recordkeeping.</w:t>
+              <w:t>2. Post-call webhooks: Automatically pushes structured JSON transcripts, verification outcomes, and audit logs to the bank's case management system for CBUAE regulatory compliance.</w:t>
             </w:r>
           </w:p>
           <w:tbl>
@@ -5683,17 +5641,17 @@
                 <w:rFonts w:ascii="Arial" w:hAnsi="Arial"/>
                 <w:sz w:val="19"/>
               </w:rPr>
-              <w:t>Opening disclosure | System prompt forces institutional identity and AI disclosure before user interaction; Scribe v2 keyword assertion validates occurrence.</w:t>
+              <w:t>Opening disclosure | Implemented today: Prompt enforces AI identity and bank disclosure; Stage 2: Scribe v2 keyword assertion validates occurrence.</w:t>
               <w:br/>
-              <w:t>Consent to be called | Dispatcher checks core banking transaction-monitoring consent flag prior to queueing outbound SIP trunk dial.</w:t>
+              <w:t>Consent to be called | Stage 2 requirement: Dispatcher checks core banking transaction-monitoring consent flag prior to queueing outbound SIP dial.</w:t>
               <w:br/>
-              <w:t>Verification without secrets | Challenge algorithm matches last four Emirates ID digits and recent transaction; zero PIN or OTP parameters exist.</w:t>
+              <w:t>Verification without secrets | Implemented today: Challenge matches low-privilege EID suffix and recent amount; zero PIN, CVV, or OTP parameters exist.</w:t>
               <w:br/>
-              <w:t>Human approval point | Irreversible actions (account termination, fund reversal) lack tool bindings; workflow routes directly to human fraud queue.</w:t>
+              <w:t>Human approval point | Implemented today: Irreversible actions lack tool bindings; workflow routes directly to human fraud queue.</w:t>
               <w:br/>
-              <w:t>Opt-out path | Scribe v2 detects stop keywords across four languages, immediately triggering graceful termination and logging opt-out state.</w:t>
+              <w:t>Opt-out path | Implemented today: Stop response routes to LIAISON; Stage 2: Scribe v2 multilingual stop-word triggers instant hangup.</w:t>
               <w:br/>
-              <w:t>Escalation trigger | Three failed verification attempts or detected customer distress automatically transitions call context to human specialist.</w:t>
+              <w:t>Escalation trigger | Implemented today: Failed verification branches to LIAISON; Stage 2: CTI warm transfer with pre-populated case packet.</w:t>
             </w:r>
           </w:p>
           <w:tbl>
@@ -6360,17 +6318,15 @@
               <w:br/>
               <w:t xml:space="preserve">  VERIFIER Sub-Agent (Scribe v2 STT + Eleven v3 Multilingual)</w:t>
               <w:br/>
-              <w:t xml:space="preserve">    Tool: verify_identity (Read-Only)</w:t>
+              <w:t xml:space="preserve">    Tool: verify_identity (Issues signed short-lived action token)</w:t>
               <w:br/>
-              <w:t xml:space="preserve">    Branch: [Verified] -&gt; GUARD Sub-Agent</w:t>
-              <w:br/>
-              <w:t xml:space="preserve">    Branch: [Failed / Opt-Out] -&gt; LIAISON Sub-Agent</w:t>
+              <w:t xml:space="preserve">    Branches: [Verified] -&gt; GUARD | [Failed / Opt-Out] -&gt; LIAISON</w:t>
               <w:br/>
               <w:t xml:space="preserve">  GUARD Sub-Agent (Tool Scoping: Inherit Tools = OFF)</w:t>
               <w:br/>
-              <w:t xml:space="preserve">    Tool: freeze_card ONLY (Single Reversible Webhook)</w:t>
+              <w:t xml:space="preserve">    Tool: freeze_card ONLY (Requires valid action token + idempotency key)</w:t>
               <w:br/>
-              <w:t xml:space="preserve">    Unconditional Transition -&gt; LIAISON Sub-Agent</w:t>
+              <w:t xml:space="preserve">    Transition -&gt; LIAISON</w:t>
               <w:br/>
               <w:t xml:space="preserve">  LIAISON Sub-Agent</w:t>
               <w:br/>
@@ -6385,7 +6341,7 @@
               <w:br/>
               <w:t>Fraud Detection Engine (Webhook Trigger)</w:t>
               <w:br/>
-              <w:t>Card Management API -&gt; Executes freeze_card</w:t>
+              <w:t>Card Management API -&gt; Executes freeze_card via fail-closed authenticated gateway</w:t>
               <w:br/>
               <w:t>Case Management DB -&gt; Receives post_call_data Audit Log</w:t>
               <w:br/>
@@ -7157,31 +7113,31 @@
                 <w:rFonts w:ascii="Arial" w:hAnsi="Arial"/>
                 <w:sz w:val="19"/>
               </w:rPr>
-              <w:t>KPI 1: Outbound Contact Delay</w:t>
+              <w:t>KPI 1: Outbound Dispatch Latency</w:t>
               <w:br/>
-              <w:t>Baseline: 6.2 minutes</w:t>
+              <w:t>Baseline (from D): Estimated 4 to 8 minutes queue delay</w:t>
               <w:br/>
-              <w:t>Target: &lt; 30 seconds</w:t>
+              <w:t>Target: &lt; 30 seconds from webhook trigger to SIP dial initiation</w:t>
               <w:br/>
-              <w:t>How measured: Difference between fraud engine alert webhook and customer pickup timestamp.</w:t>
+              <w:t>Measurement: Delta between fraud alert webhook timestamp and outbound call connection.</w:t>
               <w:br/>
               <w:br/>
-              <w:t>KPI 2: First-Attempt Contact Rate</w:t>
+              <w:t>KPI 2: Credential Solicitation Rate</w:t>
               <w:br/>
-              <w:t>Baseline: 32%</w:t>
+              <w:t>Baseline (from D): High conduct risk on manual diallers</w:t>
               <w:br/>
-              <w:t>Target: &gt; 75%</w:t>
+              <w:t>Target: 0.00% PIN/password solicitation</w:t>
               <w:br/>
-              <w:t>How measured: Completed verification calls divided by total fraud dispatches.</w:t>
+              <w:t>Measurement: Automated keyword auditing across 100% of call transcripts.</w:t>
               <w:br/>
               <w:br/>
-              <w:t>KPI 3: Fraud Loss Prevention Before Settlement</w:t>
+              <w:t>KPI 3: Protective Action Execution Reliability</w:t>
               <w:br/>
-              <w:t>Baseline: 9% recovery</w:t>
+              <w:t>Baseline (from D): 0% automated execution</w:t>
               <w:br/>
-              <w:t>Target: &gt; 85% prevented</w:t>
+              <w:t>Target: &gt; 98.0% execution reliability on verified events</w:t>
               <w:br/>
-              <w:t>How measured: Ratio of unauthorized transactions stopped prior to settlement clearing.</w:t>
+              <w:t>Measurement: Successful HTTP 200 responses from freeze_card upon verified customer confirmation.</w:t>
             </w:r>
           </w:p>
           <w:tbl>
@@ -8771,9 +8727,16 @@
                 <w:rFonts w:ascii="Arial" w:hAnsi="Arial"/>
                 <w:sz w:val="19"/>
               </w:rPr>
-              <w:t>Deployed Repository &amp; Webhook Server: https://github.com/Rishabh9306/haris-fraud-intervention</w:t>
+              <w:t>1. Deployed Repository &amp; Live Webhook Server:</w:t>
               <w:br/>
-              <w:t>Architecture Walkthrough &amp; Demo: https://haris-livid.vercel.app</w:t>
+              <w:t>https://github.com/Rishabh9306/haris-fraud-intervention</w:t>
+              <w:br/>
+              <w:t>(Live endpoints: https://haris-livid.vercel.app)</w:t>
+              <w:br/>
+              <w:br/>
+              <w:t>2. Architecture Walkthrough Recording (Mandatory):</w:t>
+              <w:br/>
+              <w:t>[INSERT 60-SECOND LOOM URL HERE - Walk through Box L diagram, ElevenLabs workflow, and live authenticated curl test]</w:t>
             </w:r>
           </w:p>
         </w:tc>

</xml_diff>

<commit_message>
Final submission artifact: Embed YouTube walkthrough video and apply clean formatting
</commit_message>
<xml_diff>
--- a/HARIS_Idea_Canvas_SUBMISSION.docx
+++ b/HARIS_Idea_Canvas_SUBMISSION.docx
@@ -208,33 +208,16 @@
           </w:tcPr>
           <w:p>
             <w:pPr>
-              <w:spacing w:after="60"/>
+              <w:spacing w:after="30" w:before="0" w:line="276" w:lineRule="auto"/>
             </w:pPr>
             <w:r/>
             <w:r>
               <w:rPr>
-                <w:rFonts w:ascii="Arial" w:hAnsi="Arial"/>
-                <w:sz w:val="19"/>
+                <w:rFonts w:ascii="Calibri" w:hAnsi="Calibri"/>
+                <w:color w:val="1A1A1A"/>
+                <w:sz w:val="18"/>
               </w:rPr>
               <w:t>Team name: HARIS</w:t>
-              <w:br/>
-              <w:t>Contact email: devilproart@gmail.com</w:t>
-              <w:br/>
-              <w:t>Track: 1 (Banking &amp; Insurance)</w:t>
-              <w:br/>
-              <w:t>Based in: Dubai, UAE</w:t>
-              <w:br/>
-              <w:t>Use case: 1 (Real-Time Fraud Intervention)</w:t>
-              <w:br/>
-              <w:t>Stage: Idea Canvas (Stage 1)</w:t>
-              <w:br/>
-              <w:t>Languages covered: English, Arabic (Gulf dialect route), Hindi, Urdu</w:t>
-              <w:br/>
-              <w:t>Prior ElevenLabs use: Y (Configured Agent Workflow in workspace)</w:t>
-              <w:br/>
-              <w:t>Team size / based in: 1 / Dubai, UAE</w:t>
-              <w:br/>
-              <w:t>Website or repo: https://github.com/Rishabh9306/haris-fraud-intervention</w:t>
             </w:r>
           </w:p>
           <w:tbl>
@@ -890,7 +873,121 @@
             </w:tr>
           </w:tbl>
           <w:p>
-            <w:r/>
+            <w:pPr>
+              <w:spacing w:before="0" w:after="30" w:line="276" w:lineRule="auto"/>
+            </w:pPr>
+            <w:r>
+              <w:rPr>
+                <w:rFonts w:ascii="Calibri" w:hAnsi="Calibri"/>
+                <w:color w:val="1A1A1A"/>
+                <w:sz w:val="18"/>
+              </w:rPr>
+              <w:t>Contact email: devilproart@gmail.com</w:t>
+            </w:r>
+          </w:p>
+          <w:p>
+            <w:pPr>
+              <w:spacing w:before="0" w:after="30" w:line="276" w:lineRule="auto"/>
+            </w:pPr>
+            <w:r>
+              <w:rPr>
+                <w:rFonts w:ascii="Calibri" w:hAnsi="Calibri"/>
+                <w:color w:val="1A1A1A"/>
+                <w:sz w:val="18"/>
+              </w:rPr>
+              <w:t>Track: 1 (Banking &amp; Insurance)</w:t>
+            </w:r>
+          </w:p>
+          <w:p>
+            <w:pPr>
+              <w:spacing w:before="0" w:after="30" w:line="276" w:lineRule="auto"/>
+            </w:pPr>
+            <w:r>
+              <w:rPr>
+                <w:rFonts w:ascii="Calibri" w:hAnsi="Calibri"/>
+                <w:color w:val="1A1A1A"/>
+                <w:sz w:val="18"/>
+              </w:rPr>
+              <w:t>Based in: Dubai, UAE</w:t>
+            </w:r>
+          </w:p>
+          <w:p>
+            <w:pPr>
+              <w:spacing w:before="0" w:after="30" w:line="276" w:lineRule="auto"/>
+            </w:pPr>
+            <w:r>
+              <w:rPr>
+                <w:rFonts w:ascii="Calibri" w:hAnsi="Calibri"/>
+                <w:color w:val="1A1A1A"/>
+                <w:sz w:val="18"/>
+              </w:rPr>
+              <w:t>Use case: 1 (Real-Time Fraud Intervention)</w:t>
+            </w:r>
+          </w:p>
+          <w:p>
+            <w:pPr>
+              <w:spacing w:before="0" w:after="30" w:line="276" w:lineRule="auto"/>
+            </w:pPr>
+            <w:r>
+              <w:rPr>
+                <w:rFonts w:ascii="Calibri" w:hAnsi="Calibri"/>
+                <w:color w:val="1A1A1A"/>
+                <w:sz w:val="18"/>
+              </w:rPr>
+              <w:t>Stage: Idea Canvas (Stage 1)</w:t>
+            </w:r>
+          </w:p>
+          <w:p>
+            <w:pPr>
+              <w:spacing w:before="0" w:after="30" w:line="276" w:lineRule="auto"/>
+            </w:pPr>
+            <w:r>
+              <w:rPr>
+                <w:rFonts w:ascii="Calibri" w:hAnsi="Calibri"/>
+                <w:color w:val="1A1A1A"/>
+                <w:sz w:val="18"/>
+              </w:rPr>
+              <w:t>Languages covered: English, Arabic (Gulf dialect route), Hindi, Urdu</w:t>
+            </w:r>
+          </w:p>
+          <w:p>
+            <w:pPr>
+              <w:spacing w:before="0" w:after="30" w:line="276" w:lineRule="auto"/>
+            </w:pPr>
+            <w:r>
+              <w:rPr>
+                <w:rFonts w:ascii="Calibri" w:hAnsi="Calibri"/>
+                <w:color w:val="1A1A1A"/>
+                <w:sz w:val="18"/>
+              </w:rPr>
+              <w:t>Prior ElevenLabs use: Y (Configured Agent Workflow in workspace)</w:t>
+            </w:r>
+          </w:p>
+          <w:p>
+            <w:pPr>
+              <w:spacing w:before="0" w:after="30" w:line="276" w:lineRule="auto"/>
+            </w:pPr>
+            <w:r>
+              <w:rPr>
+                <w:rFonts w:ascii="Calibri" w:hAnsi="Calibri"/>
+                <w:color w:val="1A1A1A"/>
+                <w:sz w:val="18"/>
+              </w:rPr>
+              <w:t>Team size / based in: 1 / Dubai, UAE</w:t>
+            </w:r>
+          </w:p>
+          <w:p>
+            <w:pPr>
+              <w:spacing w:before="0" w:after="30" w:line="276" w:lineRule="auto"/>
+            </w:pPr>
+            <w:r>
+              <w:rPr>
+                <w:rFonts w:ascii="Calibri" w:hAnsi="Calibri"/>
+                <w:color w:val="1A1A1A"/>
+                <w:sz w:val="18"/>
+              </w:rPr>
+              <w:t>Website or repo: https://github.com/Rishabh9306/haris-fraud-intervention</w:t>
+            </w:r>
           </w:p>
         </w:tc>
       </w:tr>
@@ -1054,13 +1151,14 @@
           </w:tcPr>
           <w:p>
             <w:pPr>
-              <w:spacing w:after="60"/>
+              <w:spacing w:after="30" w:before="0" w:line="276" w:lineRule="auto"/>
             </w:pPr>
             <w:r/>
             <w:r>
               <w:rPr>
-                <w:rFonts w:ascii="Arial" w:hAnsi="Arial"/>
-                <w:sz w:val="19"/>
+                <w:rFonts w:ascii="Calibri" w:hAnsi="Calibri"/>
+                <w:color w:val="1A1A1A"/>
+                <w:sz w:val="18"/>
               </w:rPr>
               <w:t>An agent that calls retail bank customers upon fraud detection for identity verification and account protection, so that unauthorized transactions freeze before settlement.</w:t>
             </w:r>
@@ -1227,13 +1325,14 @@
           </w:tcPr>
           <w:p>
             <w:pPr>
-              <w:spacing w:after="60"/>
+              <w:spacing w:after="30" w:before="0" w:line="276" w:lineRule="auto"/>
             </w:pPr>
             <w:r/>
             <w:r>
               <w:rPr>
-                <w:rFonts w:ascii="Arial" w:hAnsi="Arial"/>
-                <w:sz w:val="19"/>
+                <w:rFonts w:ascii="Calibri" w:hAnsi="Calibri"/>
+                <w:color w:val="1A1A1A"/>
+                <w:sz w:val="18"/>
               </w:rPr>
               <w:t>A fraud engine flags an anomalous transaction in milliseconds, but queues the alert into human outbound dialling pools, creating an operational contact delay where social engineering or unauthorized clearing completes. When contact occurs, expatriate customers face language friction: retail lines operate primarily in English and Arabic, leaving Hindi and Urdu speakers unable to comprehend the urgency. Furthermore, manual agents routinely ask callers for security credentials, normalizing phishing habits under CBUAE rules. The customer is left waiting, funds drain permanently, and the bank absorbs regulatory liability under notice 2025/3057.</w:t>
             </w:r>
@@ -1397,19 +1496,16 @@
           </w:tcPr>
           <w:p>
             <w:pPr>
-              <w:spacing w:after="60"/>
+              <w:spacing w:after="30" w:before="0" w:line="276" w:lineRule="auto"/>
             </w:pPr>
             <w:r/>
             <w:r>
               <w:rPr>
-                <w:rFonts w:ascii="Arial" w:hAnsi="Arial"/>
-                <w:sz w:val="19"/>
+                <w:rFonts w:ascii="Calibri" w:hAnsi="Calibri"/>
+                <w:color w:val="1A1A1A"/>
+                <w:sz w:val="18"/>
               </w:rPr>
               <w:t>Operational queue delay before outbound dial: Estimated 4 to 8 minutes in tiered contact centers.</w:t>
-              <w:br/>
-              <w:t>Market context on scam recovery: 9% of UAE scam victims fully recovered lost funds (GASA/BioCatch survey of ~2,000 UAE residents, Nov 2024).</w:t>
-              <w:br/>
-              <w:t>Institutional fraud exposure: 62% of surveyed UAE banking leaders report annual fraud losses exceeding AED 18.3 million (BioCatch survey of 100 UAE leaders, April 2026).</w:t>
             </w:r>
           </w:p>
           <w:tbl>
@@ -1705,7 +1801,30 @@
             </w:tr>
           </w:tbl>
           <w:p>
-            <w:r/>
+            <w:pPr>
+              <w:spacing w:before="0" w:after="30" w:line="276" w:lineRule="auto"/>
+            </w:pPr>
+            <w:r>
+              <w:rPr>
+                <w:rFonts w:ascii="Calibri" w:hAnsi="Calibri"/>
+                <w:color w:val="1A1A1A"/>
+                <w:sz w:val="18"/>
+              </w:rPr>
+              <w:t>Market context on scam recovery: 9% of UAE scam victims fully recovered lost funds (GASA/BioCatch survey of ~2,000 UAE residents, Nov 2024).</w:t>
+            </w:r>
+          </w:p>
+          <w:p>
+            <w:pPr>
+              <w:spacing w:before="0" w:after="30" w:line="276" w:lineRule="auto"/>
+            </w:pPr>
+            <w:r>
+              <w:rPr>
+                <w:rFonts w:ascii="Calibri" w:hAnsi="Calibri"/>
+                <w:color w:val="1A1A1A"/>
+                <w:sz w:val="18"/>
+              </w:rPr>
+              <w:t>Institutional fraud exposure: 62% of surveyed UAE banking leaders report annual fraud losses exceeding AED 18.3 million (BioCatch survey of 100 UAE leaders, April 2026).</w:t>
+            </w:r>
           </w:p>
         </w:tc>
       </w:tr>
@@ -1869,13 +1988,14 @@
           </w:tcPr>
           <w:p>
             <w:pPr>
-              <w:spacing w:after="60"/>
+              <w:spacing w:after="30" w:before="0" w:line="276" w:lineRule="auto"/>
             </w:pPr>
             <w:r/>
             <w:r>
               <w:rPr>
-                <w:rFonts w:ascii="Arial" w:hAnsi="Arial"/>
-                <w:sz w:val="19"/>
+                <w:rFonts w:ascii="Calibri" w:hAnsi="Calibri"/>
+                <w:color w:val="1A1A1A"/>
+                <w:sz w:val="18"/>
               </w:rPr>
               <w:t>UAE Retail Banks (e.g. Emirates NBD, ADCB, FAB). Signing title: Group Head of Fraud Prevention or Chief Information Security Officer (CISO). Budget line: Fraud Operations &amp; Financial Crime Compliance, accelerated by CBUAE Notice No. CBUAE/FCMCP/2025/3057 mandating institutional liability for authentication failures.</w:t>
             </w:r>
@@ -2112,13 +2232,14 @@
           </w:tcPr>
           <w:p>
             <w:pPr>
-              <w:spacing w:after="60"/>
+              <w:spacing w:after="30" w:before="0" w:line="276" w:lineRule="auto"/>
             </w:pPr>
             <w:r/>
             <w:r>
               <w:rPr>
-                <w:rFonts w:ascii="Arial" w:hAnsi="Arial"/>
-                <w:sz w:val="19"/>
+                <w:rFonts w:ascii="Calibri" w:hAnsi="Calibri"/>
+                <w:color w:val="1A1A1A"/>
+                <w:sz w:val="18"/>
               </w:rPr>
               <w:t>No primary institutional interviews were conducted for Stage 1. Operational problem definition and compliance requirements are derived strictly from CBUAE regulatory notices (Notice No. CBUAE/FCMCP/2025/3057) and published GCC fraud research (BioCatch/GASA, Nov 2024 &amp; April 2026). Primary institutional interviews are planned for the Stage 2 Build Sprint.</w:t>
             </w:r>
@@ -2493,9 +2614,6 @@
               </w:tc>
             </w:tr>
           </w:tbl>
-          <w:p>
-            <w:r/>
-          </w:p>
         </w:tc>
       </w:tr>
     </w:tbl>
@@ -2658,13 +2776,14 @@
           </w:tcPr>
           <w:p>
             <w:pPr>
-              <w:spacing w:after="60"/>
+              <w:spacing w:after="30" w:before="0" w:line="276" w:lineRule="auto"/>
             </w:pPr>
             <w:r/>
             <w:r>
               <w:rPr>
-                <w:rFonts w:ascii="Arial" w:hAnsi="Arial"/>
-                <w:sz w:val="19"/>
+                <w:rFonts w:ascii="Calibri" w:hAnsi="Calibri"/>
+                <w:color w:val="1A1A1A"/>
+                <w:sz w:val="18"/>
               </w:rPr>
               <w:t>We assumed customers would verify transactions via mobile app push notifications during the call. Operational fraud reports revealed scammers actively instruct victims to ignore notifications. We pivoted to voice-native challenge questions using public-identifier cross-checks (last four Emirates ID digits and last known merchant) without requesting secrets.</w:t>
             </w:r>
@@ -2828,21 +2947,16 @@
           </w:tcPr>
           <w:p>
             <w:pPr>
-              <w:spacing w:after="60"/>
+              <w:spacing w:after="30" w:before="0" w:line="276" w:lineRule="auto"/>
             </w:pPr>
             <w:r/>
             <w:r>
               <w:rPr>
-                <w:rFonts w:ascii="Arial" w:hAnsi="Arial"/>
-                <w:sz w:val="19"/>
+                <w:rFonts w:ascii="Calibri" w:hAnsi="Calibri"/>
+                <w:color w:val="1A1A1A"/>
+                <w:sz w:val="18"/>
               </w:rPr>
               <w:t>LANE 1 (Customer): Transaction occurs -&gt; Receives SMS alert (often missed/delayed) -&gt; Waits unaware -&gt; Receives unverified call -&gt; Skepticism/hang-up -&gt; Loss finalized.</w:t>
-              <w:br/>
-              <w:t>LANE 2 (Fraud Analyst): Alert generated in fraud engine -&gt; Ticket queued -&gt; Analyst dials customer -&gt; Language friction/no answer -&gt; Manual verification -&gt; Manual card freeze.</w:t>
-              <w:br/>
-              <w:t>LANE 3 (Back Office): Receives freeze escalation -&gt; Reviews case history -&gt; Approves card block.</w:t>
-              <w:br/>
-              <w:t>Systems Touched: Fraud Detection Engine -&gt; Outbound Contact Orchestrator -&gt; ElevenLabs Voice Agent -&gt; Bank Verification Service -&gt; Card Management Gateway -&gt; Case Management / Human Queue. (Core banking integrations are deployment-dependent). Fails at the manual queue bottleneck.</w:t>
             </w:r>
           </w:p>
           <w:tbl>
@@ -3765,21 +3879,6 @@
               </w:tc>
             </w:tr>
           </w:tbl>
-          <w:p>
-            <w:pPr>
-              <w:spacing w:after="70" w:line="20" w:lineRule="auto"/>
-            </w:pPr>
-            <w:r/>
-          </w:p>
-          <w:p>
-            <w:r/>
-          </w:p>
-          <w:p>
-            <w:pPr>
-              <w:spacing w:after="40" w:line="20" w:lineRule="auto"/>
-            </w:pPr>
-            <w:r/>
-          </w:p>
           <w:tbl>
             <w:tblPr>
               <w:tblW w:w="9780" w:type="dxa"/>
@@ -4065,7 +4164,43 @@
             </w:tr>
           </w:tbl>
           <w:p>
-            <w:r/>
+            <w:pPr>
+              <w:spacing w:before="0" w:after="30" w:line="276" w:lineRule="auto"/>
+            </w:pPr>
+            <w:r>
+              <w:rPr>
+                <w:rFonts w:ascii="Calibri" w:hAnsi="Calibri"/>
+                <w:color w:val="1A1A1A"/>
+                <w:sz w:val="18"/>
+              </w:rPr>
+              <w:t>LANE 2 (Fraud Analyst): Alert generated in fraud engine -&gt; Ticket queued -&gt; Analyst dials customer -&gt; Language friction/no answer -&gt; Manual verification -&gt; Manual card freeze.</w:t>
+            </w:r>
+          </w:p>
+          <w:p>
+            <w:pPr>
+              <w:spacing w:before="0" w:after="30" w:line="276" w:lineRule="auto"/>
+            </w:pPr>
+            <w:r>
+              <w:rPr>
+                <w:rFonts w:ascii="Calibri" w:hAnsi="Calibri"/>
+                <w:color w:val="1A1A1A"/>
+                <w:sz w:val="18"/>
+              </w:rPr>
+              <w:t>LANE 3 (Back Office): Receives freeze escalation -&gt; Reviews case history -&gt; Approves card block.</w:t>
+            </w:r>
+          </w:p>
+          <w:p>
+            <w:pPr>
+              <w:spacing w:before="0" w:after="30" w:line="276" w:lineRule="auto"/>
+            </w:pPr>
+            <w:r>
+              <w:rPr>
+                <w:rFonts w:ascii="Calibri" w:hAnsi="Calibri"/>
+                <w:color w:val="1A1A1A"/>
+                <w:sz w:val="18"/>
+              </w:rPr>
+              <w:t>Systems Touched: Fraud Detection Engine -&gt; Outbound Contact Orchestrator -&gt; ElevenLabs Voice Agent -&gt; Bank Verification Service -&gt; Card Management Gateway -&gt; Case Management / Human Queue. (Core banking integrations are deployment-dependent). Fails at the manual queue bottleneck.</w:t>
+            </w:r>
           </w:p>
         </w:tc>
       </w:tr>
@@ -4280,23 +4415,16 @@
           </w:tcPr>
           <w:p>
             <w:pPr>
-              <w:spacing w:after="60"/>
+              <w:spacing w:after="30" w:before="0" w:line="276" w:lineRule="auto"/>
             </w:pPr>
             <w:r/>
             <w:r>
               <w:rPr>
-                <w:rFonts w:ascii="Arial" w:hAnsi="Arial"/>
-                <w:sz w:val="19"/>
+                <w:rFonts w:ascii="Calibri" w:hAnsi="Calibri"/>
+                <w:color w:val="1A1A1A"/>
+                <w:sz w:val="18"/>
               </w:rPr>
               <w:t>Step 1: HARIS automated fraud alert from your bank regarding an unrecognised charge. No secrets requested.</w:t>
-              <w:br/>
-              <w:t>Step 2: VERIFIER asks last four Emirates ID digits and last approved transaction amount to confirm identity.</w:t>
-              <w:br/>
-              <w:t>Step 3: GUARD describes anomalous transaction details and requests customer verbal confirmation to freeze card.</w:t>
-              <w:br/>
-              <w:t>Step 4: GUARD executes card freeze via webhook and dispatches immediate confirmation SMS to customer.</w:t>
-              <w:br/>
-              <w:t>Step 5: LIAISON transfers customer with verified incident packet to specialized human fraud officer. (H)</w:t>
             </w:r>
           </w:p>
           <w:tbl>
@@ -4656,7 +4784,56 @@
             </w:tr>
           </w:tbl>
           <w:p>
-            <w:r/>
+            <w:pPr>
+              <w:spacing w:before="0" w:after="30" w:line="276" w:lineRule="auto"/>
+            </w:pPr>
+            <w:r>
+              <w:rPr>
+                <w:rFonts w:ascii="Calibri" w:hAnsi="Calibri"/>
+                <w:color w:val="1A1A1A"/>
+                <w:sz w:val="18"/>
+              </w:rPr>
+              <w:t>Step 2: VERIFIER asks last four Emirates ID digits and last approved transaction amount to confirm identity.</w:t>
+            </w:r>
+          </w:p>
+          <w:p>
+            <w:pPr>
+              <w:spacing w:before="0" w:after="30" w:line="276" w:lineRule="auto"/>
+            </w:pPr>
+            <w:r>
+              <w:rPr>
+                <w:rFonts w:ascii="Calibri" w:hAnsi="Calibri"/>
+                <w:color w:val="1A1A1A"/>
+                <w:sz w:val="18"/>
+              </w:rPr>
+              <w:t>Step 3: GUARD describes anomalous transaction details and requests customer verbal confirmation to freeze card.</w:t>
+            </w:r>
+          </w:p>
+          <w:p>
+            <w:pPr>
+              <w:spacing w:before="0" w:after="30" w:line="276" w:lineRule="auto"/>
+            </w:pPr>
+            <w:r>
+              <w:rPr>
+                <w:rFonts w:ascii="Calibri" w:hAnsi="Calibri"/>
+                <w:color w:val="1A1A1A"/>
+                <w:sz w:val="18"/>
+              </w:rPr>
+              <w:t>Step 4: GUARD executes card freeze via webhook and dispatches immediate confirmation SMS to customer.</w:t>
+            </w:r>
+          </w:p>
+          <w:p>
+            <w:pPr>
+              <w:spacing w:before="0" w:after="30" w:line="276" w:lineRule="auto"/>
+            </w:pPr>
+            <w:r>
+              <w:rPr>
+                <w:rFonts w:ascii="Calibri" w:hAnsi="Calibri"/>
+                <w:color w:val="1A1A1A"/>
+                <w:sz w:val="18"/>
+              </w:rPr>
+              <w:t>Step 5: LIAISON transfers customer with verified incident packet to specialized human fraud officer. (H)</w:t>
+            </w:r>
           </w:p>
         </w:tc>
       </w:tr>
@@ -4820,22 +4997,16 @@
           </w:tcPr>
           <w:p>
             <w:pPr>
-              <w:spacing w:after="60"/>
+              <w:spacing w:after="30" w:before="0" w:line="276" w:lineRule="auto"/>
             </w:pPr>
             <w:r/>
             <w:r>
               <w:rPr>
-                <w:rFonts w:ascii="Arial" w:hAnsi="Arial"/>
-                <w:sz w:val="19"/>
+                <w:rFonts w:ascii="Calibri" w:hAnsi="Calibri"/>
+                <w:color w:val="1A1A1A"/>
+                <w:sz w:val="18"/>
               </w:rPr>
               <w:t>[x] Agents Platform  [x] Agent Workflows  [x] Sub-agents  [x] Eleven v3 TTS  [x] Scribe v2 STT  [x] Server / client tools  [x] Batch calling  [x] Post-call webhooks</w:t>
-              <w:br/>
-              <w:br/>
-              <w:t>Why these two:</w:t>
-              <w:br/>
-              <w:t>1. Sub-agents with per-node tool scoping: Physically isolates freeze_card inside GUARD. Prevents unauthorized financial actions structurally rather than through prompting.</w:t>
-              <w:br/>
-              <w:t>2. Post-call webhooks: Automatically pushes structured JSON transcripts, verification outcomes, and audit logs to the bank's case management system for CBUAE regulatory compliance.</w:t>
             </w:r>
           </w:p>
           <w:tbl>
@@ -5480,12 +5651,54 @@
           </w:tbl>
           <w:p>
             <w:pPr>
-              <w:spacing w:after="100" w:line="20" w:lineRule="auto"/>
+              <w:spacing w:before="0" w:after="60" w:line="276" w:lineRule="auto"/>
             </w:pPr>
-            <w:r/>
-          </w:p>
-          <w:p>
-            <w:r/>
+            <w:r>
+              <w:rPr>
+                <w:rFonts w:ascii="Calibri" w:hAnsi="Calibri"/>
+                <w:color w:val="1A1A1A"/>
+                <w:sz w:val="18"/>
+              </w:rPr>
+            </w:r>
+          </w:p>
+          <w:p>
+            <w:pPr>
+              <w:spacing w:before="0" w:after="30" w:line="276" w:lineRule="auto"/>
+            </w:pPr>
+            <w:r>
+              <w:rPr>
+                <w:rFonts w:ascii="Calibri" w:hAnsi="Calibri"/>
+                <w:color w:val="1A1A1A"/>
+                <w:sz w:val="18"/>
+              </w:rPr>
+              <w:t>Why these two:</w:t>
+            </w:r>
+          </w:p>
+          <w:p>
+            <w:pPr>
+              <w:spacing w:before="0" w:after="30" w:line="276" w:lineRule="auto"/>
+            </w:pPr>
+            <w:r>
+              <w:rPr>
+                <w:rFonts w:ascii="Calibri" w:hAnsi="Calibri"/>
+                <w:color w:val="1A1A1A"/>
+                <w:sz w:val="18"/>
+              </w:rPr>
+              <w:t>1. Sub-agents with per-node tool scoping: Physically isolates freeze_card inside GUARD. Prevents unauthorized financial actions structurally rather than through prompting.</w:t>
+            </w:r>
+          </w:p>
+          <w:p>
+            <w:pPr>
+              <w:spacing w:before="0" w:after="30" w:line="276" w:lineRule="auto"/>
+            </w:pPr>
+            <w:r>
+              <w:rPr>
+                <w:rFonts w:ascii="Calibri" w:hAnsi="Calibri"/>
+                <w:color w:val="1A1A1A"/>
+                <w:sz w:val="18"/>
+              </w:rPr>
+              <w:t>2. Post-call webhooks: Automatically pushes structured JSON transcripts, verification outcomes, and audit logs to the bank's case management system for CBUAE regulatory compliance.</w:t>
+            </w:r>
           </w:p>
         </w:tc>
       </w:tr>
@@ -5633,25 +5846,16 @@
           </w:tcPr>
           <w:p>
             <w:pPr>
-              <w:spacing w:after="60"/>
+              <w:spacing w:after="30" w:before="0" w:line="276" w:lineRule="auto"/>
             </w:pPr>
             <w:r/>
             <w:r>
               <w:rPr>
-                <w:rFonts w:ascii="Arial" w:hAnsi="Arial"/>
-                <w:sz w:val="19"/>
+                <w:rFonts w:ascii="Calibri" w:hAnsi="Calibri"/>
+                <w:color w:val="1A1A1A"/>
+                <w:sz w:val="18"/>
               </w:rPr>
               <w:t>Opening disclosure | Implemented today: Prompt enforces AI identity and bank disclosure; Stage 2: Scribe v2 keyword assertion validates occurrence.</w:t>
-              <w:br/>
-              <w:t>Consent to be called | Stage 2 requirement: Dispatcher checks core banking transaction-monitoring consent flag prior to queueing outbound SIP dial.</w:t>
-              <w:br/>
-              <w:t>Verification without secrets | Implemented today: Challenge matches low-privilege EID suffix and recent amount; zero PIN, CVV, or OTP parameters exist.</w:t>
-              <w:br/>
-              <w:t>Human approval point | Implemented today: Irreversible actions lack tool bindings; workflow routes directly to human fraud queue.</w:t>
-              <w:br/>
-              <w:t>Opt-out path | Implemented today: Stop response routes to LIAISON; Stage 2: Scribe v2 multilingual stop-word triggers instant hangup.</w:t>
-              <w:br/>
-              <w:t>Escalation trigger | Implemented today: Failed verification branches to LIAISON; Stage 2: CTI warm transfer with pre-populated case packet.</w:t>
             </w:r>
           </w:p>
           <w:tbl>
@@ -6065,7 +6269,69 @@
             </w:tr>
           </w:tbl>
           <w:p>
-            <w:r/>
+            <w:pPr>
+              <w:spacing w:before="0" w:after="30" w:line="276" w:lineRule="auto"/>
+            </w:pPr>
+            <w:r>
+              <w:rPr>
+                <w:rFonts w:ascii="Calibri" w:hAnsi="Calibri"/>
+                <w:color w:val="1A1A1A"/>
+                <w:sz w:val="18"/>
+              </w:rPr>
+              <w:t>Consent to be called | Stage 2 requirement: Dispatcher checks core banking transaction-monitoring consent flag prior to queueing outbound SIP dial.</w:t>
+            </w:r>
+          </w:p>
+          <w:p>
+            <w:pPr>
+              <w:spacing w:before="0" w:after="30" w:line="276" w:lineRule="auto"/>
+            </w:pPr>
+            <w:r>
+              <w:rPr>
+                <w:rFonts w:ascii="Calibri" w:hAnsi="Calibri"/>
+                <w:color w:val="1A1A1A"/>
+                <w:sz w:val="18"/>
+              </w:rPr>
+              <w:t>Verification without secrets | Implemented today: Challenge matches low-privilege EID suffix and recent amount; zero PIN, CVV, or OTP parameters exist.</w:t>
+            </w:r>
+          </w:p>
+          <w:p>
+            <w:pPr>
+              <w:spacing w:before="0" w:after="30" w:line="276" w:lineRule="auto"/>
+            </w:pPr>
+            <w:r>
+              <w:rPr>
+                <w:rFonts w:ascii="Calibri" w:hAnsi="Calibri"/>
+                <w:color w:val="1A1A1A"/>
+                <w:sz w:val="18"/>
+              </w:rPr>
+              <w:t>Human approval point | Implemented today: Irreversible actions lack tool bindings; workflow routes directly to human fraud queue.</w:t>
+            </w:r>
+          </w:p>
+          <w:p>
+            <w:pPr>
+              <w:spacing w:before="0" w:after="30" w:line="276" w:lineRule="auto"/>
+            </w:pPr>
+            <w:r>
+              <w:rPr>
+                <w:rFonts w:ascii="Calibri" w:hAnsi="Calibri"/>
+                <w:color w:val="1A1A1A"/>
+                <w:sz w:val="18"/>
+              </w:rPr>
+              <w:t>Opt-out path | Implemented today: Stop response routes to LIAISON; Stage 2: Scribe v2 multilingual stop-word triggers instant hangup.</w:t>
+            </w:r>
+          </w:p>
+          <w:p>
+            <w:pPr>
+              <w:spacing w:before="0" w:after="30" w:line="276" w:lineRule="auto"/>
+            </w:pPr>
+            <w:r>
+              <w:rPr>
+                <w:rFonts w:ascii="Calibri" w:hAnsi="Calibri"/>
+                <w:color w:val="1A1A1A"/>
+                <w:sz w:val="18"/>
+              </w:rPr>
+              <w:t>Escalation trigger | Implemented today: Failed verification branches to LIAISON; Stage 2: CTI warm transfer with pre-populated case packet.</w:t>
+            </w:r>
           </w:p>
         </w:tc>
       </w:tr>
@@ -6299,53 +6565,16 @@
           </w:tcPr>
           <w:p>
             <w:pPr>
-              <w:spacing w:after="60"/>
+              <w:spacing w:after="30" w:before="0" w:line="276" w:lineRule="auto"/>
             </w:pPr>
             <w:r/>
             <w:r>
               <w:rPr>
-                <w:rFonts w:ascii="Arial" w:hAnsi="Arial"/>
-                <w:sz w:val="19"/>
+                <w:rFonts w:ascii="Calibri" w:hAnsi="Calibri"/>
+                <w:color w:val="1A1A1A"/>
+                <w:sz w:val="18"/>
               </w:rPr>
               <w:t>[ZONE 1: CALLER &amp; CHANNEL]</w:t>
-              <w:br/>
-              <w:t>Customer Mobile (UAE PSTN) &lt;---&gt; Twilio SIP Trunk (Bidirectional Audio Stream)</w:t>
-              <w:br/>
-              <w:br/>
-              <w:t>[ZONE 2: ELEVENLABS PLATFORM]</w:t>
-              <w:br/>
-              <w:t>Batch Calling Engine -&gt; Agent Workflow Graph:</w:t>
-              <w:br/>
-              <w:t xml:space="preserve">  VERIFIER Sub-Agent (Scribe v2 STT + Eleven v3 Multilingual)</w:t>
-              <w:br/>
-              <w:t xml:space="preserve">    Tool: verify_identity (Issues signed short-lived action token)</w:t>
-              <w:br/>
-              <w:t xml:space="preserve">    Branches: [Verified] -&gt; GUARD | [Failed / Opt-Out] -&gt; LIAISON</w:t>
-              <w:br/>
-              <w:t xml:space="preserve">  GUARD Sub-Agent (Tool Scoping: Inherit Tools = OFF)</w:t>
-              <w:br/>
-              <w:t xml:space="preserve">    Tool: freeze_card ONLY (Requires valid action token + idempotency key)</w:t>
-              <w:br/>
-              <w:t xml:space="preserve">    Transition -&gt; LIAISON</w:t>
-              <w:br/>
-              <w:t xml:space="preserve">  LIAISON Sub-Agent</w:t>
-              <w:br/>
-              <w:t xml:space="preserve">    Tool: post_call_data (Audit Webhook)</w:t>
-              <w:br/>
-              <w:t xml:space="preserve">    System Action: Transfer to Human Agent (H)</w:t>
-              <w:br/>
-              <w:br/>
-              <w:t>[ZONE 3: INSTITUTION SYSTEMS]</w:t>
-              <w:br/>
-              <w:t>Core Banking CRM -&gt; Reads Consent &amp; Language</w:t>
-              <w:br/>
-              <w:t>Fraud Detection Engine (Webhook Trigger)</w:t>
-              <w:br/>
-              <w:t>Card Management API -&gt; Executes freeze_card via fail-closed authenticated gateway</w:t>
-              <w:br/>
-              <w:t>Case Management DB -&gt; Receives post_call_data Audit Log</w:t>
-              <w:br/>
-              <w:t>Human Fraud Queue -&gt; Receives Warm Transfer</w:t>
             </w:r>
           </w:p>
           <w:tbl>
@@ -6588,21 +6817,6 @@
               </w:tc>
             </w:tr>
           </w:tbl>
-          <w:p>
-            <w:pPr>
-              <w:spacing w:after="70" w:line="20" w:lineRule="auto"/>
-            </w:pPr>
-            <w:r/>
-          </w:p>
-          <w:p>
-            <w:r/>
-          </w:p>
-          <w:p>
-            <w:pPr>
-              <w:spacing w:after="40" w:line="20" w:lineRule="auto"/>
-            </w:pPr>
-            <w:r/>
-          </w:p>
           <w:tbl>
             <w:tblPr>
               <w:tblW w:w="9780" w:type="dxa"/>
@@ -6888,7 +7102,262 @@
             </w:tr>
           </w:tbl>
           <w:p>
-            <w:r/>
+            <w:pPr>
+              <w:spacing w:before="0" w:after="30" w:line="276" w:lineRule="auto"/>
+            </w:pPr>
+            <w:r>
+              <w:rPr>
+                <w:rFonts w:ascii="Calibri" w:hAnsi="Calibri"/>
+                <w:color w:val="1A1A1A"/>
+                <w:sz w:val="18"/>
+              </w:rPr>
+              <w:t>Customer Mobile (UAE PSTN) &lt;---&gt; Twilio SIP Trunk (Bidirectional Audio Stream)</w:t>
+            </w:r>
+          </w:p>
+          <w:p>
+            <w:pPr>
+              <w:spacing w:before="0" w:after="60" w:line="276" w:lineRule="auto"/>
+            </w:pPr>
+            <w:r>
+              <w:rPr>
+                <w:rFonts w:ascii="Calibri" w:hAnsi="Calibri"/>
+                <w:color w:val="1A1A1A"/>
+                <w:sz w:val="18"/>
+              </w:rPr>
+            </w:r>
+          </w:p>
+          <w:p>
+            <w:pPr>
+              <w:spacing w:before="0" w:after="30" w:line="276" w:lineRule="auto"/>
+            </w:pPr>
+            <w:r>
+              <w:rPr>
+                <w:rFonts w:ascii="Calibri" w:hAnsi="Calibri"/>
+                <w:color w:val="1A1A1A"/>
+                <w:sz w:val="18"/>
+              </w:rPr>
+              <w:t>[ZONE 2: ELEVENLABS PLATFORM]</w:t>
+            </w:r>
+          </w:p>
+          <w:p>
+            <w:pPr>
+              <w:spacing w:before="0" w:after="30" w:line="276" w:lineRule="auto"/>
+            </w:pPr>
+            <w:r>
+              <w:rPr>
+                <w:rFonts w:ascii="Calibri" w:hAnsi="Calibri"/>
+                <w:color w:val="1A1A1A"/>
+                <w:sz w:val="18"/>
+              </w:rPr>
+              <w:t>Batch Calling Engine -&gt; Agent Workflow Graph:</w:t>
+            </w:r>
+          </w:p>
+          <w:p>
+            <w:pPr>
+              <w:spacing w:before="0" w:after="30" w:line="276" w:lineRule="auto"/>
+            </w:pPr>
+            <w:r>
+              <w:rPr>
+                <w:rFonts w:ascii="Calibri" w:hAnsi="Calibri"/>
+                <w:color w:val="1A1A1A"/>
+                <w:sz w:val="18"/>
+              </w:rPr>
+              <w:t xml:space="preserve">  VERIFIER Sub-Agent (Scribe v2 STT + Eleven v3 Multilingual)</w:t>
+            </w:r>
+          </w:p>
+          <w:p>
+            <w:pPr>
+              <w:spacing w:before="0" w:after="30" w:line="276" w:lineRule="auto"/>
+            </w:pPr>
+            <w:r>
+              <w:rPr>
+                <w:rFonts w:ascii="Calibri" w:hAnsi="Calibri"/>
+                <w:color w:val="1A1A1A"/>
+                <w:sz w:val="18"/>
+              </w:rPr>
+              <w:t xml:space="preserve">    Tool: verify_identity (Issues signed short-lived action token)</w:t>
+            </w:r>
+          </w:p>
+          <w:p>
+            <w:pPr>
+              <w:spacing w:before="0" w:after="30" w:line="276" w:lineRule="auto"/>
+            </w:pPr>
+            <w:r>
+              <w:rPr>
+                <w:rFonts w:ascii="Calibri" w:hAnsi="Calibri"/>
+                <w:color w:val="1A1A1A"/>
+                <w:sz w:val="18"/>
+              </w:rPr>
+              <w:t xml:space="preserve">    Branches: [Verified] -&gt; GUARD | [Failed / Opt-Out] -&gt; LIAISON</w:t>
+            </w:r>
+          </w:p>
+          <w:p>
+            <w:pPr>
+              <w:spacing w:before="0" w:after="30" w:line="276" w:lineRule="auto"/>
+            </w:pPr>
+            <w:r>
+              <w:rPr>
+                <w:rFonts w:ascii="Calibri" w:hAnsi="Calibri"/>
+                <w:color w:val="1A1A1A"/>
+                <w:sz w:val="18"/>
+              </w:rPr>
+              <w:t xml:space="preserve">  GUARD Sub-Agent (Tool Scoping: Inherit Tools = OFF)</w:t>
+            </w:r>
+          </w:p>
+          <w:p>
+            <w:pPr>
+              <w:spacing w:before="0" w:after="30" w:line="276" w:lineRule="auto"/>
+            </w:pPr>
+            <w:r>
+              <w:rPr>
+                <w:rFonts w:ascii="Calibri" w:hAnsi="Calibri"/>
+                <w:color w:val="1A1A1A"/>
+                <w:sz w:val="18"/>
+              </w:rPr>
+              <w:t xml:space="preserve">    Tool: freeze_card ONLY (Requires valid action token + idempotency key)</w:t>
+            </w:r>
+          </w:p>
+          <w:p>
+            <w:pPr>
+              <w:spacing w:before="0" w:after="30" w:line="276" w:lineRule="auto"/>
+            </w:pPr>
+            <w:r>
+              <w:rPr>
+                <w:rFonts w:ascii="Calibri" w:hAnsi="Calibri"/>
+                <w:color w:val="1A1A1A"/>
+                <w:sz w:val="18"/>
+              </w:rPr>
+              <w:t xml:space="preserve">    Transition -&gt; LIAISON</w:t>
+            </w:r>
+          </w:p>
+          <w:p>
+            <w:pPr>
+              <w:spacing w:before="0" w:after="30" w:line="276" w:lineRule="auto"/>
+            </w:pPr>
+            <w:r>
+              <w:rPr>
+                <w:rFonts w:ascii="Calibri" w:hAnsi="Calibri"/>
+                <w:color w:val="1A1A1A"/>
+                <w:sz w:val="18"/>
+              </w:rPr>
+              <w:t xml:space="preserve">  LIAISON Sub-Agent</w:t>
+            </w:r>
+          </w:p>
+          <w:p>
+            <w:pPr>
+              <w:spacing w:before="0" w:after="30" w:line="276" w:lineRule="auto"/>
+            </w:pPr>
+            <w:r>
+              <w:rPr>
+                <w:rFonts w:ascii="Calibri" w:hAnsi="Calibri"/>
+                <w:color w:val="1A1A1A"/>
+                <w:sz w:val="18"/>
+              </w:rPr>
+              <w:t xml:space="preserve">    Tool: post_call_data (Audit Webhook)</w:t>
+            </w:r>
+          </w:p>
+          <w:p>
+            <w:pPr>
+              <w:spacing w:before="0" w:after="30" w:line="276" w:lineRule="auto"/>
+            </w:pPr>
+            <w:r>
+              <w:rPr>
+                <w:rFonts w:ascii="Calibri" w:hAnsi="Calibri"/>
+                <w:color w:val="1A1A1A"/>
+                <w:sz w:val="18"/>
+              </w:rPr>
+              <w:t xml:space="preserve">    System Action: Transfer to Human Agent (H)</w:t>
+            </w:r>
+          </w:p>
+          <w:p>
+            <w:pPr>
+              <w:spacing w:before="0" w:after="60" w:line="276" w:lineRule="auto"/>
+            </w:pPr>
+            <w:r>
+              <w:rPr>
+                <w:rFonts w:ascii="Calibri" w:hAnsi="Calibri"/>
+                <w:color w:val="1A1A1A"/>
+                <w:sz w:val="18"/>
+              </w:rPr>
+            </w:r>
+          </w:p>
+          <w:p>
+            <w:pPr>
+              <w:spacing w:before="0" w:after="30" w:line="276" w:lineRule="auto"/>
+            </w:pPr>
+            <w:r>
+              <w:rPr>
+                <w:rFonts w:ascii="Calibri" w:hAnsi="Calibri"/>
+                <w:color w:val="1A1A1A"/>
+                <w:sz w:val="18"/>
+              </w:rPr>
+              <w:t>[ZONE 3: INSTITUTION SYSTEMS]</w:t>
+            </w:r>
+          </w:p>
+          <w:p>
+            <w:pPr>
+              <w:spacing w:before="0" w:after="30" w:line="276" w:lineRule="auto"/>
+            </w:pPr>
+            <w:r>
+              <w:rPr>
+                <w:rFonts w:ascii="Calibri" w:hAnsi="Calibri"/>
+                <w:color w:val="1A1A1A"/>
+                <w:sz w:val="18"/>
+              </w:rPr>
+              <w:t>Core Banking CRM -&gt; Reads Consent &amp; Language</w:t>
+            </w:r>
+          </w:p>
+          <w:p>
+            <w:pPr>
+              <w:spacing w:before="0" w:after="30" w:line="276" w:lineRule="auto"/>
+            </w:pPr>
+            <w:r>
+              <w:rPr>
+                <w:rFonts w:ascii="Calibri" w:hAnsi="Calibri"/>
+                <w:color w:val="1A1A1A"/>
+                <w:sz w:val="18"/>
+              </w:rPr>
+              <w:t>Fraud Detection Engine (Webhook Trigger)</w:t>
+            </w:r>
+          </w:p>
+          <w:p>
+            <w:pPr>
+              <w:spacing w:before="0" w:after="30" w:line="276" w:lineRule="auto"/>
+            </w:pPr>
+            <w:r>
+              <w:rPr>
+                <w:rFonts w:ascii="Calibri" w:hAnsi="Calibri"/>
+                <w:color w:val="1A1A1A"/>
+                <w:sz w:val="18"/>
+              </w:rPr>
+              <w:t>Card Management API -&gt; Executes freeze_card via fail-closed authenticated gateway</w:t>
+            </w:r>
+          </w:p>
+          <w:p>
+            <w:pPr>
+              <w:spacing w:before="0" w:after="30" w:line="276" w:lineRule="auto"/>
+            </w:pPr>
+            <w:r>
+              <w:rPr>
+                <w:rFonts w:ascii="Calibri" w:hAnsi="Calibri"/>
+                <w:color w:val="1A1A1A"/>
+                <w:sz w:val="18"/>
+              </w:rPr>
+              <w:t>Case Management DB -&gt; Receives post_call_data Audit Log</w:t>
+            </w:r>
+          </w:p>
+          <w:p>
+            <w:pPr>
+              <w:spacing w:before="0" w:after="30" w:line="276" w:lineRule="auto"/>
+            </w:pPr>
+            <w:r>
+              <w:rPr>
+                <w:rFonts w:ascii="Calibri" w:hAnsi="Calibri"/>
+                <w:color w:val="1A1A1A"/>
+                <w:sz w:val="18"/>
+              </w:rPr>
+              <w:t>Human Fraud Queue -&gt; Receives Warm Transfer</w:t>
+            </w:r>
           </w:p>
         </w:tc>
       </w:tr>
@@ -7105,39 +7574,16 @@
           </w:tcPr>
           <w:p>
             <w:pPr>
-              <w:spacing w:after="60"/>
+              <w:spacing w:after="30" w:before="0" w:line="276" w:lineRule="auto"/>
             </w:pPr>
             <w:r/>
             <w:r>
               <w:rPr>
-                <w:rFonts w:ascii="Arial" w:hAnsi="Arial"/>
-                <w:sz w:val="19"/>
+                <w:rFonts w:ascii="Calibri" w:hAnsi="Calibri"/>
+                <w:color w:val="1A1A1A"/>
+                <w:sz w:val="18"/>
               </w:rPr>
               <w:t>KPI 1: Outbound Dispatch Latency</w:t>
-              <w:br/>
-              <w:t>Baseline (from D): Estimated 4 to 8 minutes queue delay</w:t>
-              <w:br/>
-              <w:t>Target: &lt; 30 seconds from webhook trigger to SIP dial initiation</w:t>
-              <w:br/>
-              <w:t>Measurement: Delta between fraud alert webhook timestamp and outbound call connection.</w:t>
-              <w:br/>
-              <w:br/>
-              <w:t>KPI 2: Credential Solicitation Rate</w:t>
-              <w:br/>
-              <w:t>Baseline (from D): High conduct risk on manual diallers</w:t>
-              <w:br/>
-              <w:t>Target: 0.00% PIN/password solicitation</w:t>
-              <w:br/>
-              <w:t>Measurement: Automated keyword auditing across 100% of call transcripts.</w:t>
-              <w:br/>
-              <w:br/>
-              <w:t>KPI 3: Protective Action Execution Reliability</w:t>
-              <w:br/>
-              <w:t>Baseline (from D): 0% automated execution</w:t>
-              <w:br/>
-              <w:t>Target: &gt; 98.0% execution reliability on verified events</w:t>
-              <w:br/>
-              <w:t>Measurement: Successful HTTP 200 responses from freeze_card upon verified customer confirmation.</w:t>
             </w:r>
           </w:p>
           <w:tbl>
@@ -7510,7 +7956,171 @@
             </w:tr>
           </w:tbl>
           <w:p>
-            <w:r/>
+            <w:pPr>
+              <w:spacing w:before="0" w:after="30" w:line="276" w:lineRule="auto"/>
+            </w:pPr>
+            <w:r>
+              <w:rPr>
+                <w:rFonts w:ascii="Calibri" w:hAnsi="Calibri"/>
+                <w:color w:val="1A1A1A"/>
+                <w:sz w:val="18"/>
+              </w:rPr>
+              <w:t>Baseline (from D): Estimated 4 to 8 minutes queue delay</w:t>
+            </w:r>
+          </w:p>
+          <w:p>
+            <w:pPr>
+              <w:spacing w:before="0" w:after="30" w:line="276" w:lineRule="auto"/>
+            </w:pPr>
+            <w:r>
+              <w:rPr>
+                <w:rFonts w:ascii="Calibri" w:hAnsi="Calibri"/>
+                <w:color w:val="1A1A1A"/>
+                <w:sz w:val="18"/>
+              </w:rPr>
+              <w:t>Target: &lt; 30 seconds from webhook trigger to SIP dial initiation</w:t>
+            </w:r>
+          </w:p>
+          <w:p>
+            <w:pPr>
+              <w:spacing w:before="0" w:after="30" w:line="276" w:lineRule="auto"/>
+            </w:pPr>
+            <w:r>
+              <w:rPr>
+                <w:rFonts w:ascii="Calibri" w:hAnsi="Calibri"/>
+                <w:color w:val="1A1A1A"/>
+                <w:sz w:val="18"/>
+              </w:rPr>
+              <w:t>Measurement: Delta between fraud alert webhook timestamp and outbound call connection.</w:t>
+            </w:r>
+          </w:p>
+          <w:p>
+            <w:pPr>
+              <w:spacing w:before="0" w:after="60" w:line="276" w:lineRule="auto"/>
+            </w:pPr>
+            <w:r>
+              <w:rPr>
+                <w:rFonts w:ascii="Calibri" w:hAnsi="Calibri"/>
+                <w:color w:val="1A1A1A"/>
+                <w:sz w:val="18"/>
+              </w:rPr>
+            </w:r>
+          </w:p>
+          <w:p>
+            <w:pPr>
+              <w:spacing w:before="0" w:after="30" w:line="276" w:lineRule="auto"/>
+            </w:pPr>
+            <w:r>
+              <w:rPr>
+                <w:rFonts w:ascii="Calibri" w:hAnsi="Calibri"/>
+                <w:color w:val="1A1A1A"/>
+                <w:sz w:val="18"/>
+              </w:rPr>
+              <w:t>KPI 2: Credential Solicitation Rate</w:t>
+            </w:r>
+          </w:p>
+          <w:p>
+            <w:pPr>
+              <w:spacing w:before="0" w:after="30" w:line="276" w:lineRule="auto"/>
+            </w:pPr>
+            <w:r>
+              <w:rPr>
+                <w:rFonts w:ascii="Calibri" w:hAnsi="Calibri"/>
+                <w:color w:val="1A1A1A"/>
+                <w:sz w:val="18"/>
+              </w:rPr>
+              <w:t>Baseline (from D): High conduct risk on manual diallers</w:t>
+            </w:r>
+          </w:p>
+          <w:p>
+            <w:pPr>
+              <w:spacing w:before="0" w:after="30" w:line="276" w:lineRule="auto"/>
+            </w:pPr>
+            <w:r>
+              <w:rPr>
+                <w:rFonts w:ascii="Calibri" w:hAnsi="Calibri"/>
+                <w:color w:val="1A1A1A"/>
+                <w:sz w:val="18"/>
+              </w:rPr>
+              <w:t>Target: 0.00% PIN/password solicitation</w:t>
+            </w:r>
+          </w:p>
+          <w:p>
+            <w:pPr>
+              <w:spacing w:before="0" w:after="30" w:line="276" w:lineRule="auto"/>
+            </w:pPr>
+            <w:r>
+              <w:rPr>
+                <w:rFonts w:ascii="Calibri" w:hAnsi="Calibri"/>
+                <w:color w:val="1A1A1A"/>
+                <w:sz w:val="18"/>
+              </w:rPr>
+              <w:t>Measurement: Automated keyword auditing across 100% of call transcripts.</w:t>
+            </w:r>
+          </w:p>
+          <w:p>
+            <w:pPr>
+              <w:spacing w:before="0" w:after="60" w:line="276" w:lineRule="auto"/>
+            </w:pPr>
+            <w:r>
+              <w:rPr>
+                <w:rFonts w:ascii="Calibri" w:hAnsi="Calibri"/>
+                <w:color w:val="1A1A1A"/>
+                <w:sz w:val="18"/>
+              </w:rPr>
+            </w:r>
+          </w:p>
+          <w:p>
+            <w:pPr>
+              <w:spacing w:before="0" w:after="30" w:line="276" w:lineRule="auto"/>
+            </w:pPr>
+            <w:r>
+              <w:rPr>
+                <w:rFonts w:ascii="Calibri" w:hAnsi="Calibri"/>
+                <w:color w:val="1A1A1A"/>
+                <w:sz w:val="18"/>
+              </w:rPr>
+              <w:t>KPI 3: Protective Action Execution Reliability</w:t>
+            </w:r>
+          </w:p>
+          <w:p>
+            <w:pPr>
+              <w:spacing w:before="0" w:after="30" w:line="276" w:lineRule="auto"/>
+            </w:pPr>
+            <w:r>
+              <w:rPr>
+                <w:rFonts w:ascii="Calibri" w:hAnsi="Calibri"/>
+                <w:color w:val="1A1A1A"/>
+                <w:sz w:val="18"/>
+              </w:rPr>
+              <w:t>Baseline (from D): 0% automated execution</w:t>
+            </w:r>
+          </w:p>
+          <w:p>
+            <w:pPr>
+              <w:spacing w:before="0" w:after="30" w:line="276" w:lineRule="auto"/>
+            </w:pPr>
+            <w:r>
+              <w:rPr>
+                <w:rFonts w:ascii="Calibri" w:hAnsi="Calibri"/>
+                <w:color w:val="1A1A1A"/>
+                <w:sz w:val="18"/>
+              </w:rPr>
+              <w:t>Target: &gt; 98.0% execution reliability on verified events</w:t>
+            </w:r>
+          </w:p>
+          <w:p>
+            <w:pPr>
+              <w:spacing w:before="0" w:after="30" w:line="276" w:lineRule="auto"/>
+            </w:pPr>
+            <w:r>
+              <w:rPr>
+                <w:rFonts w:ascii="Calibri" w:hAnsi="Calibri"/>
+                <w:color w:val="1A1A1A"/>
+                <w:sz w:val="18"/>
+              </w:rPr>
+              <w:t>Measurement: Successful HTTP 200 responses from freeze_card upon verified customer confirmation.</w:t>
+            </w:r>
           </w:p>
         </w:tc>
       </w:tr>
@@ -7658,27 +8268,16 @@
           </w:tcPr>
           <w:p>
             <w:pPr>
-              <w:spacing w:after="60"/>
+              <w:spacing w:after="30" w:before="0" w:line="276" w:lineRule="auto"/>
             </w:pPr>
             <w:r/>
             <w:r>
               <w:rPr>
-                <w:rFonts w:ascii="Arial" w:hAnsi="Arial"/>
-                <w:sz w:val="19"/>
+                <w:rFonts w:ascii="Calibri" w:hAnsi="Calibri"/>
+                <w:color w:val="1A1A1A"/>
+                <w:sz w:val="18"/>
               </w:rPr>
               <w:t>Risk 1: Customer assumes outbound AI voice is a phishing impersonator and disconnects.</w:t>
-              <w:br/>
-              <w:t>How handled: Agent recites unique recent transaction reference visible in user's mobile banking app to establish mutual trust.</w:t>
-              <w:br/>
-              <w:br/>
-              <w:t>Risk 2: Dialect mismatch in multilingual STT fails legitimate customer identity verification.</w:t>
-              <w:br/>
-              <w:t>How handled: Scribe v2 keyterm biasing optimizes regional phonetics; failed attempts gracefully escalate to native-speaking human agents without lockouts.</w:t>
-              <w:br/>
-              <w:br/>
-              <w:t>Risk 3: Accidental freeze of legitimate transactions causes customer friction and merchant embarrassment.</w:t>
-              <w:br/>
-              <w:t>How handled: Freeze is strictly temporary (24-hour hold); unfreeze action is accessible via single-tap in official banking application.</w:t>
             </w:r>
           </w:p>
           <w:tbl>
@@ -7930,7 +8529,93 @@
             </w:tr>
           </w:tbl>
           <w:p>
-            <w:r/>
+            <w:pPr>
+              <w:spacing w:before="0" w:after="30" w:line="276" w:lineRule="auto"/>
+            </w:pPr>
+            <w:r>
+              <w:rPr>
+                <w:rFonts w:ascii="Calibri" w:hAnsi="Calibri"/>
+                <w:color w:val="1A1A1A"/>
+                <w:sz w:val="18"/>
+              </w:rPr>
+              <w:t>How handled: Agent recites unique recent transaction reference visible in user's mobile banking app to establish mutual trust.</w:t>
+            </w:r>
+          </w:p>
+          <w:p>
+            <w:pPr>
+              <w:spacing w:before="0" w:after="60" w:line="276" w:lineRule="auto"/>
+            </w:pPr>
+            <w:r>
+              <w:rPr>
+                <w:rFonts w:ascii="Calibri" w:hAnsi="Calibri"/>
+                <w:color w:val="1A1A1A"/>
+                <w:sz w:val="18"/>
+              </w:rPr>
+            </w:r>
+          </w:p>
+          <w:p>
+            <w:pPr>
+              <w:spacing w:before="0" w:after="30" w:line="276" w:lineRule="auto"/>
+            </w:pPr>
+            <w:r>
+              <w:rPr>
+                <w:rFonts w:ascii="Calibri" w:hAnsi="Calibri"/>
+                <w:color w:val="1A1A1A"/>
+                <w:sz w:val="18"/>
+              </w:rPr>
+              <w:t>Risk 2: Dialect mismatch in multilingual STT fails legitimate customer identity verification.</w:t>
+            </w:r>
+          </w:p>
+          <w:p>
+            <w:pPr>
+              <w:spacing w:before="0" w:after="30" w:line="276" w:lineRule="auto"/>
+            </w:pPr>
+            <w:r>
+              <w:rPr>
+                <w:rFonts w:ascii="Calibri" w:hAnsi="Calibri"/>
+                <w:color w:val="1A1A1A"/>
+                <w:sz w:val="18"/>
+              </w:rPr>
+              <w:t>How handled: Scribe v2 keyterm biasing optimizes regional phonetics; failed attempts gracefully escalate to native-speaking human agents without lockouts.</w:t>
+            </w:r>
+          </w:p>
+          <w:p>
+            <w:pPr>
+              <w:spacing w:before="0" w:after="60" w:line="276" w:lineRule="auto"/>
+            </w:pPr>
+            <w:r>
+              <w:rPr>
+                <w:rFonts w:ascii="Calibri" w:hAnsi="Calibri"/>
+                <w:color w:val="1A1A1A"/>
+                <w:sz w:val="18"/>
+              </w:rPr>
+            </w:r>
+          </w:p>
+          <w:p>
+            <w:pPr>
+              <w:spacing w:before="0" w:after="30" w:line="276" w:lineRule="auto"/>
+            </w:pPr>
+            <w:r>
+              <w:rPr>
+                <w:rFonts w:ascii="Calibri" w:hAnsi="Calibri"/>
+                <w:color w:val="1A1A1A"/>
+                <w:sz w:val="18"/>
+              </w:rPr>
+              <w:t>Risk 3: Accidental freeze of legitimate transactions causes customer friction and merchant embarrassment.</w:t>
+            </w:r>
+          </w:p>
+          <w:p>
+            <w:pPr>
+              <w:spacing w:before="0" w:after="30" w:line="276" w:lineRule="auto"/>
+            </w:pPr>
+            <w:r>
+              <w:rPr>
+                <w:rFonts w:ascii="Calibri" w:hAnsi="Calibri"/>
+                <w:color w:val="1A1A1A"/>
+                <w:sz w:val="18"/>
+              </w:rPr>
+              <w:t>How handled: Freeze is strictly temporary (24-hour hold); unfreeze action is accessible via single-tap in official banking application.</w:t>
+            </w:r>
           </w:p>
         </w:tc>
       </w:tr>
@@ -8094,13 +8779,14 @@
           </w:tcPr>
           <w:p>
             <w:pPr>
-              <w:spacing w:after="60"/>
+              <w:spacing w:after="30" w:before="0" w:line="276" w:lineRule="auto"/>
             </w:pPr>
             <w:r/>
             <w:r>
               <w:rPr>
-                <w:rFonts w:ascii="Arial" w:hAnsi="Arial"/>
-                <w:sz w:val="19"/>
+                <w:rFonts w:ascii="Calibri" w:hAnsi="Calibri"/>
+                <w:color w:val="1A1A1A"/>
+                <w:sz w:val="18"/>
               </w:rPr>
               <w:t>Working end-to-end: live outbound SIP dialling on test UAE numbers; three-sub-agent workflow (VERIFIER, GUARD, LIAISON) with verified tool isolation; live REST execution of freeze_card and verify_identity mock webhooks; automated post-call audit webhook publishing; English and Gulf Arabic voice fluency. Mocked: production core-banking ledger and live SMS gateway dispatch.</w:t>
             </w:r>
@@ -8251,13 +8937,14 @@
           </w:tcPr>
           <w:p>
             <w:pPr>
-              <w:spacing w:after="60"/>
+              <w:spacing w:after="30" w:before="0" w:line="276" w:lineRule="auto"/>
             </w:pPr>
             <w:r/>
             <w:r>
               <w:rPr>
-                <w:rFonts w:ascii="Arial" w:hAnsi="Arial"/>
-                <w:sz w:val="19"/>
+                <w:rFonts w:ascii="Calibri" w:hAnsi="Calibri"/>
+                <w:color w:val="1A1A1A"/>
+                <w:sz w:val="18"/>
               </w:rPr>
               <w:t>Rishabh Gupta | Solution Architect &amp; Voice AI Engineer | https://github.com/Rishabh9306/haris-fraud-intervention</w:t>
             </w:r>
@@ -8554,9 +9241,6 @@
               </w:tc>
             </w:tr>
           </w:tbl>
-          <w:p>
-            <w:r/>
-          </w:p>
         </w:tc>
       </w:tr>
     </w:tbl>
@@ -8719,24 +9403,80 @@
           </w:tcPr>
           <w:p>
             <w:pPr>
-              <w:spacing w:after="60"/>
+              <w:spacing w:after="30" w:before="0" w:line="276" w:lineRule="auto"/>
             </w:pPr>
             <w:r/>
             <w:r>
               <w:rPr>
-                <w:rFonts w:ascii="Arial" w:hAnsi="Arial"/>
-                <w:sz w:val="19"/>
+                <w:rFonts w:ascii="Calibri" w:hAnsi="Calibri"/>
+                <w:color w:val="1A1A1A"/>
+                <w:sz w:val="18"/>
               </w:rPr>
               <w:t>1. Deployed Repository &amp; Live Webhook Server:</w:t>
-              <w:br/>
+            </w:r>
+          </w:p>
+          <w:p>
+            <w:pPr>
+              <w:spacing w:before="0" w:after="30" w:line="276" w:lineRule="auto"/>
+            </w:pPr>
+            <w:r>
+              <w:rPr>
+                <w:rFonts w:ascii="Calibri" w:hAnsi="Calibri"/>
+                <w:color w:val="1A1A1A"/>
+                <w:sz w:val="18"/>
+              </w:rPr>
               <w:t>https://github.com/Rishabh9306/haris-fraud-intervention</w:t>
-              <w:br/>
+            </w:r>
+          </w:p>
+          <w:p>
+            <w:pPr>
+              <w:spacing w:before="0" w:after="30" w:line="276" w:lineRule="auto"/>
+            </w:pPr>
+            <w:r>
+              <w:rPr>
+                <w:rFonts w:ascii="Calibri" w:hAnsi="Calibri"/>
+                <w:color w:val="1A1A1A"/>
+                <w:sz w:val="18"/>
+              </w:rPr>
               <w:t>(Live endpoints: https://haris-livid.vercel.app)</w:t>
-              <w:br/>
-              <w:br/>
-              <w:t>2. Architecture Walkthrough Recording (Mandatory):</w:t>
-              <w:br/>
-              <w:t>[INSERT 60-SECOND LOOM URL HERE - Walk through Box L diagram, ElevenLabs workflow, and live authenticated curl test]</w:t>
+            </w:r>
+          </w:p>
+          <w:p>
+            <w:pPr>
+              <w:spacing w:before="0" w:after="60" w:line="276" w:lineRule="auto"/>
+            </w:pPr>
+            <w:r>
+              <w:rPr>
+                <w:rFonts w:ascii="Calibri" w:hAnsi="Calibri"/>
+                <w:color w:val="1A1A1A"/>
+                <w:sz w:val="18"/>
+              </w:rPr>
+            </w:r>
+          </w:p>
+          <w:p>
+            <w:pPr>
+              <w:spacing w:before="0" w:after="30" w:line="276" w:lineRule="auto"/>
+            </w:pPr>
+            <w:r>
+              <w:rPr>
+                <w:rFonts w:ascii="Calibri" w:hAnsi="Calibri"/>
+                <w:color w:val="1A1A1A"/>
+                <w:sz w:val="18"/>
+              </w:rPr>
+              <w:t>2. Architecture Walkthrough Recording (60-second video):</w:t>
+            </w:r>
+          </w:p>
+          <w:p>
+            <w:pPr>
+              <w:spacing w:before="0" w:after="30" w:line="276" w:lineRule="auto"/>
+            </w:pPr>
+            <w:r>
+              <w:rPr>
+                <w:rFonts w:ascii="Calibri" w:hAnsi="Calibri"/>
+                <w:color w:val="1A1A1A"/>
+                <w:sz w:val="18"/>
+              </w:rPr>
+              <w:t>https://www.youtube.com/watch?v=jZrxzNQsjtI</w:t>
             </w:r>
           </w:p>
         </w:tc>

</xml_diff>